<commit_message>
Bring the deck and the test-plan note up to the 19 October fixes
The commits of 19 October closed `DEF-14` - `affectsCharge` now decides at `N_CL_ChargeImpactDecision`
- and added the fourth record of 15 October. The deck and one paragraph of the test plan still read
as they did before: slide 8 listed the DEF-14 condition as still open, slide 11 listed it under
"what is not done", and the references counted three records of 15 October. The deck generator is
corrected and the deck regenerated.

The test plan's note on the `57b3c1d` re-run said `TC-13` and `TC-16` had never been run and that
`DEF-14` was still intent rather than a guard, in the present tense. It now says what that run did
not cover and where each item stands - the scenarios were driven on 15 October, and the condition
now decides at a gateway - rather than presenting the position of 28 September as current. The Word
rendering and the copies in `submission/` are refreshed with it.
</commit_message>
<xml_diff>
--- a/submission/shared/test-plan.docx
+++ b/submission/shared/test-plan.docx
@@ -17071,7 +17071,7 @@
     </w:p>
     <w:p>
       <w:r>
-        <w:t xml:space="preserve">What the re-run still does not cover is unchanged: </w:t>
+        <w:t xml:space="preserve">What that re-run did not cover, and where it stands now: </w:t>
       </w:r>
       <w:r>
         <w:rPr>
@@ -17091,7 +17091,17 @@
         <w:t>TC-16</w:t>
       </w:r>
       <w:r>
-        <w:t xml:space="preserve"> have still never been run, the user-task variables are still supplied with the completion call rather than by a signed-in user (</w:t>
+        <w:t xml:space="preserve"> were not run at that point - both were driven on 15 October at </w:t>
+      </w:r>
+      <w:r>
+        <w:rPr>
+          <w:rFonts w:ascii="Consolas" w:hAnsi="Consolas"/>
+          <w:sz w:val="17"/>
+        </w:rPr>
+        <w:t>378b319</w:t>
+      </w:r>
+      <w:r>
+        <w:t xml:space="preserve"> - the user-task variables are supplied with the completion call rather than by a signed-in user (</w:t>
       </w:r>
       <w:r>
         <w:rPr>
@@ -17101,7 +17111,7 @@
         <w:t>DEF-08</w:t>
       </w:r>
       <w:r>
-        <w:t>), role-based access cannot be exercised at all (</w:t>
+        <w:t>), and role-based access cannot be exercised (</w:t>
       </w:r>
       <w:r>
         <w:rPr>
@@ -17111,7 +17121,7 @@
         <w:t>DEF-07</w:t>
       </w:r>
       <w:r>
-        <w:t xml:space="preserve">), and the one condition </w:t>
+        <w:t xml:space="preserve">); the last two remain open. The condition </w:t>
       </w:r>
       <w:r>
         <w:rPr>
@@ -17121,7 +17131,7 @@
         <w:t>DEF-14</w:t>
       </w:r>
       <w:r>
-        <w:t xml:space="preserve"> leaves on an activity's only outgoing flow is still documentation of intent rather than a guard.</w:t>
+        <w:t xml:space="preserve"> then left on an activity's only outgoing flow was documentation of intent rather than a guard; it now decides at a gateway (2026-10-19).</w:t>
       </w:r>
     </w:p>
     <w:p>

</xml_diff>